<commit_message>
Cambios de estilos en las interfaces
</commit_message>
<xml_diff>
--- a/Modelos_documentos/tdr_tipoA_.docx
+++ b/Modelos_documentos/tdr_tipoA_.docx
@@ -825,7 +825,7 @@
     <w:tbl>
       <w:tblPr>
         <w:tblStyle w:val="TableNormal"/>
-        <w:tblW w:w="0" w:type="auto"/>
+        <w:tblW w:w="9062" w:type="dxa"/>
         <w:tblInd w:w="5" w:type="dxa"/>
         <w:tblBorders>
           <w:top w:val="single" w:sz="4" w:space="0" w:color="000000"/>
@@ -839,8 +839,8 @@
         <w:tblLook w:val="01E0" w:firstRow="1" w:lastRow="1" w:firstColumn="1" w:lastColumn="1" w:noHBand="0" w:noVBand="0"/>
       </w:tblPr>
       <w:tblGrid>
-        <w:gridCol w:w="2561"/>
-        <w:gridCol w:w="5086"/>
+        <w:gridCol w:w="1975"/>
+        <w:gridCol w:w="7087"/>
       </w:tblGrid>
       <w:tr>
         <w:trPr>
@@ -848,7 +848,7 @@
         </w:trPr>
         <w:tc>
           <w:tcPr>
-            <w:tcW w:w="2561" w:type="dxa"/>
+            <w:tcW w:w="1975" w:type="dxa"/>
           </w:tcPr>
           <w:p>
             <w:pPr>
@@ -874,7 +874,7 @@
         </w:tc>
         <w:tc>
           <w:tcPr>
-            <w:tcW w:w="5086" w:type="dxa"/>
+            <w:tcW w:w="7087" w:type="dxa"/>
           </w:tcPr>
           <w:p>
             <w:pPr>
@@ -906,23 +906,12 @@
         </w:trPr>
         <w:tc>
           <w:tcPr>
-            <w:tcW w:w="2561" w:type="dxa"/>
+            <w:tcW w:w="1975" w:type="dxa"/>
+            <w:vAlign w:val="center"/>
           </w:tcPr>
           <w:p>
             <w:pPr>
               <w:pStyle w:val="TableParagraph"/>
-              <w:spacing w:before="1"/>
-              <w:ind w:left="0"/>
-              <w:rPr>
-                <w:rFonts w:ascii="Arial"/>
-                <w:b/>
-                <w:sz w:val="19"/>
-              </w:rPr>
-            </w:pPr>
-          </w:p>
-          <w:p>
-            <w:pPr>
-              <w:pStyle w:val="TableParagraph"/>
               <w:ind w:left="105"/>
               <w:rPr>
                 <w:sz w:val="18"/>
@@ -951,7 +940,8 @@
         </w:tc>
         <w:tc>
           <w:tcPr>
-            <w:tcW w:w="5086" w:type="dxa"/>
+            <w:tcW w:w="7087" w:type="dxa"/>
+            <w:vAlign w:val="center"/>
           </w:tcPr>
           <w:p>
             <w:pPr>
@@ -965,21 +955,49 @@
               <w:rPr>
                 <w:sz w:val="18"/>
               </w:rPr>
-              <w:t xml:space="preserve">Maestría en Didáctica de idiomas extranjeros. Título a nombre de la Nación como profesora del idioma de </w:t>
-            </w:r>
-            <w:r>
-              <w:rPr>
-                <w:b/>
-                <w:bCs/>
-                <w:sz w:val="18"/>
-              </w:rPr>
-              <w:t>docente_idioma</w:t>
+              <w:t>Maestría y Doctorado, preferentemente de Humanidades.</w:t>
+            </w:r>
+            <w:r>
+              <w:rPr>
+                <w:sz w:val="18"/>
+              </w:rPr>
+              <w:t xml:space="preserve"> </w:t>
+            </w:r>
+            <w:r>
+              <w:rPr>
+                <w:sz w:val="18"/>
+              </w:rPr>
+              <w:t>Certificado de estudios de idiomas del nivel B2 o Certificado Internacional o Certificación emitida por Ministerio de Educación, Ministerio de Cultura o sus equivalentes en el territorio nacional</w:t>
+            </w:r>
+            <w:r>
+              <w:rPr>
+                <w:sz w:val="18"/>
+              </w:rPr>
+              <w:t xml:space="preserve">, en </w:t>
+            </w:r>
+            <w:r>
+              <w:rPr>
+                <w:sz w:val="18"/>
+              </w:rPr>
+              <w:t>idioma extranjero u originario</w:t>
             </w:r>
             <w:r>
               <w:rPr>
                 <w:sz w:val="18"/>
               </w:rPr>
               <w:t>.</w:t>
+            </w:r>
+            <w:r>
+              <w:rPr>
+                <w:sz w:val="18"/>
+              </w:rPr>
+              <w:t xml:space="preserve"> </w:t>
+            </w:r>
+            <w:r>
+              <w:rPr>
+                <w:sz w:val="18"/>
+              </w:rPr>
+              <w:t>Curso de Metodología de la enseñanza en idiomas o equivalentes.</w:t>
             </w:r>
           </w:p>
         </w:tc>
@@ -990,7 +1008,8 @@
         </w:trPr>
         <w:tc>
           <w:tcPr>
-            <w:tcW w:w="2561" w:type="dxa"/>
+            <w:tcW w:w="1975" w:type="dxa"/>
+            <w:vAlign w:val="center"/>
           </w:tcPr>
           <w:p>
             <w:pPr>
@@ -1023,7 +1042,8 @@
         </w:tc>
         <w:tc>
           <w:tcPr>
-            <w:tcW w:w="5086" w:type="dxa"/>
+            <w:tcW w:w="7087" w:type="dxa"/>
+            <w:vAlign w:val="center"/>
           </w:tcPr>
           <w:p>
             <w:pPr>
@@ -1275,7 +1295,8 @@
         </w:trPr>
         <w:tc>
           <w:tcPr>
-            <w:tcW w:w="2561" w:type="dxa"/>
+            <w:tcW w:w="1975" w:type="dxa"/>
+            <w:vAlign w:val="center"/>
           </w:tcPr>
           <w:p>
             <w:pPr>
@@ -1321,7 +1342,8 @@
         </w:tc>
         <w:tc>
           <w:tcPr>
-            <w:tcW w:w="5086" w:type="dxa"/>
+            <w:tcW w:w="7087" w:type="dxa"/>
+            <w:vAlign w:val="center"/>
           </w:tcPr>
           <w:p>
             <w:pPr>
@@ -3342,7 +3364,6 @@
       <w:lvlJc w:val="left"/>
       <w:pPr>
         <w:ind w:left="568" w:hanging="567"/>
-        <w:jc w:val="left"/>
       </w:pPr>
       <w:rPr>
         <w:rFonts w:ascii="Arial" w:eastAsia="Arial" w:hAnsi="Arial" w:cs="Arial" w:hint="default"/>

</xml_diff>

<commit_message>
Refactor service modality handling and update document models to use new modality text representation
</commit_message>
<xml_diff>
--- a/Modelos_documentos/tdr_tipoA_.docx
+++ b/Modelos_documentos/tdr_tipoA_.docx
@@ -1,6 +1,6 @@
 
 <file path=word/document.xml><?xml version="1.0" encoding="utf-8"?>
-<w:document xmlns:wpc="http://schemas.microsoft.com/office/word/2010/wordprocessingCanvas" xmlns:cx="http://schemas.microsoft.com/office/drawing/2014/chartex" xmlns:mc="http://schemas.openxmlformats.org/markup-compatibility/2006" xmlns:o="urn:schemas-microsoft-com:office:office" xmlns:r="http://schemas.openxmlformats.org/officeDocument/2006/relationships" xmlns:m="http://schemas.openxmlformats.org/officeDocument/2006/math" xmlns:v="urn:schemas-microsoft-com:vml" xmlns:wp14="http://schemas.microsoft.com/office/word/2010/wordprocessingDrawing" xmlns:wp="http://schemas.openxmlformats.org/drawingml/2006/wordprocessingDrawing" xmlns:w10="urn:schemas-microsoft-com:office:word" xmlns:w="http://schemas.openxmlformats.org/wordprocessingml/2006/main" xmlns:w14="http://schemas.microsoft.com/office/word/2010/wordml" xmlns:w15="http://schemas.microsoft.com/office/word/2012/wordml" xmlns:w16se="http://schemas.microsoft.com/office/word/2015/wordml/symex" xmlns:wpg="http://schemas.microsoft.com/office/word/2010/wordprocessingGroup" xmlns:wpi="http://schemas.microsoft.com/office/word/2010/wordprocessingInk" xmlns:wne="http://schemas.microsoft.com/office/word/2006/wordml" xmlns:wps="http://schemas.microsoft.com/office/word/2010/wordprocessingShape" mc:Ignorable="w14 w15 w16se wp14">
+<w:document xmlns:wpc="http://schemas.microsoft.com/office/word/2010/wordprocessingCanvas" xmlns:cx="http://schemas.microsoft.com/office/drawing/2014/chartex" xmlns:cx1="http://schemas.microsoft.com/office/drawing/2015/9/8/chartex" xmlns:cx2="http://schemas.microsoft.com/office/drawing/2015/10/21/chartex" xmlns:cx3="http://schemas.microsoft.com/office/drawing/2016/5/9/chartex" xmlns:cx4="http://schemas.microsoft.com/office/drawing/2016/5/10/chartex" xmlns:cx5="http://schemas.microsoft.com/office/drawing/2016/5/11/chartex" xmlns:cx6="http://schemas.microsoft.com/office/drawing/2016/5/12/chartex" xmlns:cx7="http://schemas.microsoft.com/office/drawing/2016/5/13/chartex" xmlns:cx8="http://schemas.microsoft.com/office/drawing/2016/5/14/chartex" xmlns:mc="http://schemas.openxmlformats.org/markup-compatibility/2006" xmlns:aink="http://schemas.microsoft.com/office/drawing/2016/ink" xmlns:am3d="http://schemas.microsoft.com/office/drawing/2017/model3d" xmlns:o="urn:schemas-microsoft-com:office:office" xmlns:oel="http://schemas.microsoft.com/office/2019/extlst" xmlns:r="http://schemas.openxmlformats.org/officeDocument/2006/relationships" xmlns:m="http://schemas.openxmlformats.org/officeDocument/2006/math" xmlns:v="urn:schemas-microsoft-com:vml" xmlns:wp14="http://schemas.microsoft.com/office/word/2010/wordprocessingDrawing" xmlns:wp="http://schemas.openxmlformats.org/drawingml/2006/wordprocessingDrawing" xmlns:w10="urn:schemas-microsoft-com:office:word" xmlns:w="http://schemas.openxmlformats.org/wordprocessingml/2006/main" xmlns:w14="http://schemas.microsoft.com/office/word/2010/wordml" xmlns:w15="http://schemas.microsoft.com/office/word/2012/wordml" xmlns:w16cex="http://schemas.microsoft.com/office/word/2018/wordml/cex" xmlns:w16cid="http://schemas.microsoft.com/office/word/2016/wordml/cid" xmlns:w16="http://schemas.microsoft.com/office/word/2018/wordml" xmlns:w16du="http://schemas.microsoft.com/office/word/2023/wordml/word16du" xmlns:w16sdtdh="http://schemas.microsoft.com/office/word/2020/wordml/sdtdatahash" xmlns:w16sdtfl="http://schemas.microsoft.com/office/word/2024/wordml/sdtformatlock" xmlns:w16se="http://schemas.microsoft.com/office/word/2015/wordml/symex" xmlns:wpg="http://schemas.microsoft.com/office/word/2010/wordprocessingGroup" xmlns:wpi="http://schemas.microsoft.com/office/word/2010/wordprocessingInk" xmlns:wne="http://schemas.microsoft.com/office/word/2006/wordml" xmlns:wps="http://schemas.microsoft.com/office/word/2010/wordprocessingShape" mc:Ignorable="w14 w15 w16se w16cid w16 w16cex w16sdtdh w16sdtfl w16du wp14">
   <w:body>
     <w:p>
       <w:pPr>
@@ -268,7 +268,6 @@
           <w:b w:val="0"/>
         </w:rPr>
       </w:pPr>
-      <w:proofErr w:type="spellStart"/>
       <w:r>
         <w:rPr>
           <w:rFonts w:ascii="Garamond" w:hAnsi="Garamond"/>
@@ -277,7 +276,6 @@
         </w:rPr>
         <w:t>descripcion</w:t>
       </w:r>
-      <w:proofErr w:type="spellEnd"/>
       <w:r>
         <w:rPr>
           <w:rFonts w:ascii="Garamond" w:hAnsi="Garamond"/>
@@ -1788,20 +1786,18 @@
         <w:ind w:left="0" w:firstLine="0"/>
         <w:rPr>
           <w:rFonts w:ascii="Garamond" w:hAnsi="Garamond"/>
-          <w:b w:val="0"/>
-          <w:spacing w:val="-2"/>
-        </w:rPr>
-      </w:pPr>
-      <w:r>
-        <w:rPr>
-          <w:rFonts w:ascii="Garamond" w:hAnsi="Garamond"/>
-          <w:b w:val="0"/>
-          <w:spacing w:val="-2"/>
-        </w:rPr>
-        <w:t>Híbrida</w:t>
-      </w:r>
-      <w:bookmarkStart w:id="3" w:name="_GoBack"/>
-      <w:bookmarkEnd w:id="3"/>
+        </w:rPr>
+      </w:pPr>
+      <w:proofErr w:type="spellStart"/>
+      <w:r>
+        <w:rPr>
+          <w:rFonts w:ascii="Garamond" w:hAnsi="Garamond"/>
+          <w:b w:val="0"/>
+          <w:spacing w:val="-2"/>
+        </w:rPr>
+        <w:t>modalidad_servicio</w:t>
+      </w:r>
+      <w:proofErr w:type="spellEnd"/>
     </w:p>
     <w:p>
       <w:pPr>
@@ -1833,69 +1829,69 @@
           <w:rFonts w:ascii="Garamond" w:hAnsi="Garamond"/>
         </w:rPr>
       </w:pPr>
-      <w:bookmarkStart w:id="4" w:name="VII._LUGAR_DE_PRESTACIÓN_DEL_SERVICIO:"/>
+      <w:bookmarkStart w:id="3" w:name="VII._LUGAR_DE_PRESTACIÓN_DEL_SERVICIO:"/>
+      <w:bookmarkEnd w:id="3"/>
+      <w:r>
+        <w:rPr>
+          <w:rFonts w:ascii="Garamond" w:hAnsi="Garamond"/>
+        </w:rPr>
+        <w:t>LUGAR</w:t>
+      </w:r>
+      <w:r>
+        <w:rPr>
+          <w:rFonts w:ascii="Garamond" w:hAnsi="Garamond"/>
+          <w:spacing w:val="-16"/>
+        </w:rPr>
+        <w:t xml:space="preserve"> </w:t>
+      </w:r>
+      <w:r>
+        <w:rPr>
+          <w:rFonts w:ascii="Garamond" w:hAnsi="Garamond"/>
+        </w:rPr>
+        <w:t>DE</w:t>
+      </w:r>
+      <w:r>
+        <w:rPr>
+          <w:rFonts w:ascii="Garamond" w:hAnsi="Garamond"/>
+          <w:spacing w:val="-12"/>
+        </w:rPr>
+        <w:t xml:space="preserve"> </w:t>
+      </w:r>
+      <w:r>
+        <w:rPr>
+          <w:rFonts w:ascii="Garamond" w:hAnsi="Garamond"/>
+        </w:rPr>
+        <w:t>PRESTACIÓN</w:t>
+      </w:r>
+      <w:r>
+        <w:rPr>
+          <w:rFonts w:ascii="Garamond" w:hAnsi="Garamond"/>
+          <w:spacing w:val="-11"/>
+        </w:rPr>
+        <w:t xml:space="preserve"> </w:t>
+      </w:r>
+      <w:r>
+        <w:rPr>
+          <w:rFonts w:ascii="Garamond" w:hAnsi="Garamond"/>
+        </w:rPr>
+        <w:t>DEL</w:t>
+      </w:r>
+      <w:r>
+        <w:rPr>
+          <w:rFonts w:ascii="Garamond" w:hAnsi="Garamond"/>
+          <w:spacing w:val="-10"/>
+        </w:rPr>
+        <w:t xml:space="preserve"> </w:t>
+      </w:r>
+      <w:r>
+        <w:rPr>
+          <w:rFonts w:ascii="Garamond" w:hAnsi="Garamond"/>
+          <w:spacing w:val="-2"/>
+        </w:rPr>
+        <w:t>SERVICIO:</w:t>
+      </w:r>
+      <w:bookmarkStart w:id="4" w:name="VIII._PLAZO_DEL_SERVICIO:"/>
       <w:bookmarkEnd w:id="4"/>
-      <w:r>
-        <w:rPr>
-          <w:rFonts w:ascii="Garamond" w:hAnsi="Garamond"/>
-        </w:rPr>
-        <w:t>LUGAR</w:t>
-      </w:r>
-      <w:r>
-        <w:rPr>
-          <w:rFonts w:ascii="Garamond" w:hAnsi="Garamond"/>
-          <w:spacing w:val="-16"/>
-        </w:rPr>
-        <w:t xml:space="preserve"> </w:t>
-      </w:r>
-      <w:r>
-        <w:rPr>
-          <w:rFonts w:ascii="Garamond" w:hAnsi="Garamond"/>
-        </w:rPr>
-        <w:t>DE</w:t>
-      </w:r>
-      <w:r>
-        <w:rPr>
-          <w:rFonts w:ascii="Garamond" w:hAnsi="Garamond"/>
-          <w:spacing w:val="-12"/>
-        </w:rPr>
-        <w:t xml:space="preserve"> </w:t>
-      </w:r>
-      <w:r>
-        <w:rPr>
-          <w:rFonts w:ascii="Garamond" w:hAnsi="Garamond"/>
-        </w:rPr>
-        <w:t>PRESTACIÓN</w:t>
-      </w:r>
-      <w:r>
-        <w:rPr>
-          <w:rFonts w:ascii="Garamond" w:hAnsi="Garamond"/>
-          <w:spacing w:val="-11"/>
-        </w:rPr>
-        <w:t xml:space="preserve"> </w:t>
-      </w:r>
-      <w:r>
-        <w:rPr>
-          <w:rFonts w:ascii="Garamond" w:hAnsi="Garamond"/>
-        </w:rPr>
-        <w:t>DEL</w:t>
-      </w:r>
-      <w:r>
-        <w:rPr>
-          <w:rFonts w:ascii="Garamond" w:hAnsi="Garamond"/>
-          <w:spacing w:val="-10"/>
-        </w:rPr>
-        <w:t xml:space="preserve"> </w:t>
-      </w:r>
-      <w:r>
-        <w:rPr>
-          <w:rFonts w:ascii="Garamond" w:hAnsi="Garamond"/>
-          <w:spacing w:val="-2"/>
-        </w:rPr>
-        <w:t>SERVICIO:</w:t>
-      </w:r>
-      <w:bookmarkStart w:id="5" w:name="VIII._PLAZO_DEL_SERVICIO:"/>
-      <w:bookmarkEnd w:id="5"/>
     </w:p>
     <w:p>
       <w:pPr>
@@ -2832,8 +2828,8 @@
           <w:rFonts w:ascii="Garamond" w:hAnsi="Garamond"/>
         </w:rPr>
       </w:pPr>
-      <w:bookmarkStart w:id="6" w:name="IX._MONTO_REFERENCIAL:"/>
-      <w:bookmarkEnd w:id="6"/>
+      <w:bookmarkStart w:id="5" w:name="IX._MONTO_REFERENCIAL:"/>
+      <w:bookmarkEnd w:id="5"/>
       <w:r>
         <w:rPr>
           <w:rFonts w:ascii="Garamond" w:hAnsi="Garamond"/>
@@ -3387,49 +3383,8 @@
           <w:rFonts w:ascii="Garamond" w:hAnsi="Garamond"/>
           <w:b/>
         </w:rPr>
-        <w:t xml:space="preserve">Guillaume </w:t>
-      </w:r>
-      <w:proofErr w:type="spellStart"/>
-      <w:r>
-        <w:rPr>
-          <w:rFonts w:ascii="Garamond" w:hAnsi="Garamond"/>
-          <w:b/>
-        </w:rPr>
-        <w:t>Yannick</w:t>
-      </w:r>
-      <w:proofErr w:type="spellEnd"/>
-      <w:r>
-        <w:rPr>
-          <w:rFonts w:ascii="Garamond" w:hAnsi="Garamond"/>
-          <w:b/>
-        </w:rPr>
-        <w:t xml:space="preserve"> </w:t>
-      </w:r>
-      <w:proofErr w:type="spellStart"/>
-      <w:r>
-        <w:rPr>
-          <w:rFonts w:ascii="Garamond" w:hAnsi="Garamond"/>
-          <w:b/>
-        </w:rPr>
-        <w:t>Serge</w:t>
-      </w:r>
-      <w:proofErr w:type="spellEnd"/>
-      <w:r>
-        <w:rPr>
-          <w:rFonts w:ascii="Garamond" w:hAnsi="Garamond"/>
-          <w:b/>
-        </w:rPr>
-        <w:t xml:space="preserve"> </w:t>
-      </w:r>
-      <w:proofErr w:type="spellStart"/>
-      <w:r>
-        <w:rPr>
-          <w:rFonts w:ascii="Garamond" w:hAnsi="Garamond"/>
-          <w:b/>
-        </w:rPr>
-        <w:t>Oisel</w:t>
-      </w:r>
-      <w:proofErr w:type="spellEnd"/>
+        <w:t>Guillaume Yannick Serge Oisel</w:t>
+      </w:r>
     </w:p>
     <w:p>
       <w:pPr>
@@ -3490,7 +3445,7 @@
 </file>
 
 <file path=word/endnotes.xml><?xml version="1.0" encoding="utf-8"?>
-<w:endnotes xmlns:wpc="http://schemas.microsoft.com/office/word/2010/wordprocessingCanvas" xmlns:cx="http://schemas.microsoft.com/office/drawing/2014/chartex" xmlns:mc="http://schemas.openxmlformats.org/markup-compatibility/2006" xmlns:o="urn:schemas-microsoft-com:office:office" xmlns:r="http://schemas.openxmlformats.org/officeDocument/2006/relationships" xmlns:m="http://schemas.openxmlformats.org/officeDocument/2006/math" xmlns:v="urn:schemas-microsoft-com:vml" xmlns:wp14="http://schemas.microsoft.com/office/word/2010/wordprocessingDrawing" xmlns:wp="http://schemas.openxmlformats.org/drawingml/2006/wordprocessingDrawing" xmlns:w10="urn:schemas-microsoft-com:office:word" xmlns:w="http://schemas.openxmlformats.org/wordprocessingml/2006/main" xmlns:w14="http://schemas.microsoft.com/office/word/2010/wordml" xmlns:w15="http://schemas.microsoft.com/office/word/2012/wordml" xmlns:w16se="http://schemas.microsoft.com/office/word/2015/wordml/symex" xmlns:wpg="http://schemas.microsoft.com/office/word/2010/wordprocessingGroup" xmlns:wpi="http://schemas.microsoft.com/office/word/2010/wordprocessingInk" xmlns:wne="http://schemas.microsoft.com/office/word/2006/wordml" xmlns:wps="http://schemas.microsoft.com/office/word/2010/wordprocessingShape" mc:Ignorable="w14 w15 w16se wp14">
+<w:endnotes xmlns:wpc="http://schemas.microsoft.com/office/word/2010/wordprocessingCanvas" xmlns:cx="http://schemas.microsoft.com/office/drawing/2014/chartex" xmlns:cx1="http://schemas.microsoft.com/office/drawing/2015/9/8/chartex" xmlns:cx2="http://schemas.microsoft.com/office/drawing/2015/10/21/chartex" xmlns:cx3="http://schemas.microsoft.com/office/drawing/2016/5/9/chartex" xmlns:cx4="http://schemas.microsoft.com/office/drawing/2016/5/10/chartex" xmlns:cx5="http://schemas.microsoft.com/office/drawing/2016/5/11/chartex" xmlns:cx6="http://schemas.microsoft.com/office/drawing/2016/5/12/chartex" xmlns:cx7="http://schemas.microsoft.com/office/drawing/2016/5/13/chartex" xmlns:cx8="http://schemas.microsoft.com/office/drawing/2016/5/14/chartex" xmlns:mc="http://schemas.openxmlformats.org/markup-compatibility/2006" xmlns:aink="http://schemas.microsoft.com/office/drawing/2016/ink" xmlns:am3d="http://schemas.microsoft.com/office/drawing/2017/model3d" xmlns:o="urn:schemas-microsoft-com:office:office" xmlns:oel="http://schemas.microsoft.com/office/2019/extlst" xmlns:r="http://schemas.openxmlformats.org/officeDocument/2006/relationships" xmlns:m="http://schemas.openxmlformats.org/officeDocument/2006/math" xmlns:v="urn:schemas-microsoft-com:vml" xmlns:wp14="http://schemas.microsoft.com/office/word/2010/wordprocessingDrawing" xmlns:wp="http://schemas.openxmlformats.org/drawingml/2006/wordprocessingDrawing" xmlns:w10="urn:schemas-microsoft-com:office:word" xmlns:w="http://schemas.openxmlformats.org/wordprocessingml/2006/main" xmlns:w14="http://schemas.microsoft.com/office/word/2010/wordml" xmlns:w15="http://schemas.microsoft.com/office/word/2012/wordml" xmlns:w16cex="http://schemas.microsoft.com/office/word/2018/wordml/cex" xmlns:w16cid="http://schemas.microsoft.com/office/word/2016/wordml/cid" xmlns:w16="http://schemas.microsoft.com/office/word/2018/wordml" xmlns:w16du="http://schemas.microsoft.com/office/word/2023/wordml/word16du" xmlns:w16sdtdh="http://schemas.microsoft.com/office/word/2020/wordml/sdtdatahash" xmlns:w16sdtfl="http://schemas.microsoft.com/office/word/2024/wordml/sdtformatlock" xmlns:w16se="http://schemas.microsoft.com/office/word/2015/wordml/symex" xmlns:wpg="http://schemas.microsoft.com/office/word/2010/wordprocessingGroup" xmlns:wpi="http://schemas.microsoft.com/office/word/2010/wordprocessingInk" xmlns:wne="http://schemas.microsoft.com/office/word/2006/wordml" xmlns:wps="http://schemas.microsoft.com/office/word/2010/wordprocessingShape" mc:Ignorable="w14 w15 w16se w16cid w16 w16cex w16sdtdh w16sdtfl w16du wp14">
   <w:endnote w:type="separator" w:id="-1">
     <w:p>
       <w:r>
@@ -3509,7 +3464,7 @@
 </file>
 
 <file path=word/footnotes.xml><?xml version="1.0" encoding="utf-8"?>
-<w:footnotes xmlns:wpc="http://schemas.microsoft.com/office/word/2010/wordprocessingCanvas" xmlns:cx="http://schemas.microsoft.com/office/drawing/2014/chartex" xmlns:mc="http://schemas.openxmlformats.org/markup-compatibility/2006" xmlns:o="urn:schemas-microsoft-com:office:office" xmlns:r="http://schemas.openxmlformats.org/officeDocument/2006/relationships" xmlns:m="http://schemas.openxmlformats.org/officeDocument/2006/math" xmlns:v="urn:schemas-microsoft-com:vml" xmlns:wp14="http://schemas.microsoft.com/office/word/2010/wordprocessingDrawing" xmlns:wp="http://schemas.openxmlformats.org/drawingml/2006/wordprocessingDrawing" xmlns:w10="urn:schemas-microsoft-com:office:word" xmlns:w="http://schemas.openxmlformats.org/wordprocessingml/2006/main" xmlns:w14="http://schemas.microsoft.com/office/word/2010/wordml" xmlns:w15="http://schemas.microsoft.com/office/word/2012/wordml" xmlns:w16se="http://schemas.microsoft.com/office/word/2015/wordml/symex" xmlns:wpg="http://schemas.microsoft.com/office/word/2010/wordprocessingGroup" xmlns:wpi="http://schemas.microsoft.com/office/word/2010/wordprocessingInk" xmlns:wne="http://schemas.microsoft.com/office/word/2006/wordml" xmlns:wps="http://schemas.microsoft.com/office/word/2010/wordprocessingShape" mc:Ignorable="w14 w15 w16se wp14">
+<w:footnotes xmlns:wpc="http://schemas.microsoft.com/office/word/2010/wordprocessingCanvas" xmlns:cx="http://schemas.microsoft.com/office/drawing/2014/chartex" xmlns:cx1="http://schemas.microsoft.com/office/drawing/2015/9/8/chartex" xmlns:cx2="http://schemas.microsoft.com/office/drawing/2015/10/21/chartex" xmlns:cx3="http://schemas.microsoft.com/office/drawing/2016/5/9/chartex" xmlns:cx4="http://schemas.microsoft.com/office/drawing/2016/5/10/chartex" xmlns:cx5="http://schemas.microsoft.com/office/drawing/2016/5/11/chartex" xmlns:cx6="http://schemas.microsoft.com/office/drawing/2016/5/12/chartex" xmlns:cx7="http://schemas.microsoft.com/office/drawing/2016/5/13/chartex" xmlns:cx8="http://schemas.microsoft.com/office/drawing/2016/5/14/chartex" xmlns:mc="http://schemas.openxmlformats.org/markup-compatibility/2006" xmlns:aink="http://schemas.microsoft.com/office/drawing/2016/ink" xmlns:am3d="http://schemas.microsoft.com/office/drawing/2017/model3d" xmlns:o="urn:schemas-microsoft-com:office:office" xmlns:oel="http://schemas.microsoft.com/office/2019/extlst" xmlns:r="http://schemas.openxmlformats.org/officeDocument/2006/relationships" xmlns:m="http://schemas.openxmlformats.org/officeDocument/2006/math" xmlns:v="urn:schemas-microsoft-com:vml" xmlns:wp14="http://schemas.microsoft.com/office/word/2010/wordprocessingDrawing" xmlns:wp="http://schemas.openxmlformats.org/drawingml/2006/wordprocessingDrawing" xmlns:w10="urn:schemas-microsoft-com:office:word" xmlns:w="http://schemas.openxmlformats.org/wordprocessingml/2006/main" xmlns:w14="http://schemas.microsoft.com/office/word/2010/wordml" xmlns:w15="http://schemas.microsoft.com/office/word/2012/wordml" xmlns:w16cex="http://schemas.microsoft.com/office/word/2018/wordml/cex" xmlns:w16cid="http://schemas.microsoft.com/office/word/2016/wordml/cid" xmlns:w16="http://schemas.microsoft.com/office/word/2018/wordml" xmlns:w16du="http://schemas.microsoft.com/office/word/2023/wordml/word16du" xmlns:w16sdtdh="http://schemas.microsoft.com/office/word/2020/wordml/sdtdatahash" xmlns:w16sdtfl="http://schemas.microsoft.com/office/word/2024/wordml/sdtformatlock" xmlns:w16se="http://schemas.microsoft.com/office/word/2015/wordml/symex" xmlns:wpg="http://schemas.microsoft.com/office/word/2010/wordprocessingGroup" xmlns:wpi="http://schemas.microsoft.com/office/word/2010/wordprocessingInk" xmlns:wne="http://schemas.microsoft.com/office/word/2006/wordml" xmlns:wps="http://schemas.microsoft.com/office/word/2010/wordprocessingShape" mc:Ignorable="w14 w15 w16se w16cid w16 w16cex w16sdtdh w16sdtfl w16du wp14">
   <w:footnote w:type="separator" w:id="-1">
     <w:p>
       <w:r>
@@ -3528,7 +3483,7 @@
 </file>
 
 <file path=word/header1.xml><?xml version="1.0" encoding="utf-8"?>
-<w:hdr xmlns:wpc="http://schemas.microsoft.com/office/word/2010/wordprocessingCanvas" xmlns:cx="http://schemas.microsoft.com/office/drawing/2014/chartex" xmlns:mc="http://schemas.openxmlformats.org/markup-compatibility/2006" xmlns:o="urn:schemas-microsoft-com:office:office" xmlns:r="http://schemas.openxmlformats.org/officeDocument/2006/relationships" xmlns:m="http://schemas.openxmlformats.org/officeDocument/2006/math" xmlns:v="urn:schemas-microsoft-com:vml" xmlns:wp14="http://schemas.microsoft.com/office/word/2010/wordprocessingDrawing" xmlns:wp="http://schemas.openxmlformats.org/drawingml/2006/wordprocessingDrawing" xmlns:w10="urn:schemas-microsoft-com:office:word" xmlns:w="http://schemas.openxmlformats.org/wordprocessingml/2006/main" xmlns:w14="http://schemas.microsoft.com/office/word/2010/wordml" xmlns:w15="http://schemas.microsoft.com/office/word/2012/wordml" xmlns:w16se="http://schemas.microsoft.com/office/word/2015/wordml/symex" xmlns:wpg="http://schemas.microsoft.com/office/word/2010/wordprocessingGroup" xmlns:wpi="http://schemas.microsoft.com/office/word/2010/wordprocessingInk" xmlns:wne="http://schemas.microsoft.com/office/word/2006/wordml" xmlns:wps="http://schemas.microsoft.com/office/word/2010/wordprocessingShape" mc:Ignorable="w14 w15 w16se wp14">
+<w:hdr xmlns:wpc="http://schemas.microsoft.com/office/word/2010/wordprocessingCanvas" xmlns:cx="http://schemas.microsoft.com/office/drawing/2014/chartex" xmlns:cx1="http://schemas.microsoft.com/office/drawing/2015/9/8/chartex" xmlns:cx2="http://schemas.microsoft.com/office/drawing/2015/10/21/chartex" xmlns:cx3="http://schemas.microsoft.com/office/drawing/2016/5/9/chartex" xmlns:cx4="http://schemas.microsoft.com/office/drawing/2016/5/10/chartex" xmlns:cx5="http://schemas.microsoft.com/office/drawing/2016/5/11/chartex" xmlns:cx6="http://schemas.microsoft.com/office/drawing/2016/5/12/chartex" xmlns:cx7="http://schemas.microsoft.com/office/drawing/2016/5/13/chartex" xmlns:cx8="http://schemas.microsoft.com/office/drawing/2016/5/14/chartex" xmlns:mc="http://schemas.openxmlformats.org/markup-compatibility/2006" xmlns:aink="http://schemas.microsoft.com/office/drawing/2016/ink" xmlns:am3d="http://schemas.microsoft.com/office/drawing/2017/model3d" xmlns:o="urn:schemas-microsoft-com:office:office" xmlns:oel="http://schemas.microsoft.com/office/2019/extlst" xmlns:r="http://schemas.openxmlformats.org/officeDocument/2006/relationships" xmlns:m="http://schemas.openxmlformats.org/officeDocument/2006/math" xmlns:v="urn:schemas-microsoft-com:vml" xmlns:wp14="http://schemas.microsoft.com/office/word/2010/wordprocessingDrawing" xmlns:wp="http://schemas.openxmlformats.org/drawingml/2006/wordprocessingDrawing" xmlns:w10="urn:schemas-microsoft-com:office:word" xmlns:w="http://schemas.openxmlformats.org/wordprocessingml/2006/main" xmlns:w14="http://schemas.microsoft.com/office/word/2010/wordml" xmlns:w15="http://schemas.microsoft.com/office/word/2012/wordml" xmlns:w16cex="http://schemas.microsoft.com/office/word/2018/wordml/cex" xmlns:w16cid="http://schemas.microsoft.com/office/word/2016/wordml/cid" xmlns:w16="http://schemas.microsoft.com/office/word/2018/wordml" xmlns:w16du="http://schemas.microsoft.com/office/word/2023/wordml/word16du" xmlns:w16sdtdh="http://schemas.microsoft.com/office/word/2020/wordml/sdtdatahash" xmlns:w16sdtfl="http://schemas.microsoft.com/office/word/2024/wordml/sdtformatlock" xmlns:w16se="http://schemas.microsoft.com/office/word/2015/wordml/symex" xmlns:wpg="http://schemas.microsoft.com/office/word/2010/wordprocessingGroup" xmlns:wpi="http://schemas.microsoft.com/office/word/2010/wordprocessingInk" xmlns:wne="http://schemas.microsoft.com/office/word/2006/wordml" xmlns:wps="http://schemas.microsoft.com/office/word/2010/wordprocessingShape" mc:Ignorable="w14 w15 w16se w16cid w16 w16cex w16sdtdh w16sdtfl w16du wp14">
   <w:p>
     <w:pPr>
       <w:pStyle w:val="Encabezado"/>
@@ -3605,7 +3560,7 @@
 </file>
 
 <file path=word/numbering.xml><?xml version="1.0" encoding="utf-8"?>
-<w:numbering xmlns:wpc="http://schemas.microsoft.com/office/word/2010/wordprocessingCanvas" xmlns:cx="http://schemas.microsoft.com/office/drawing/2014/chartex" xmlns:mc="http://schemas.openxmlformats.org/markup-compatibility/2006" xmlns:o="urn:schemas-microsoft-com:office:office" xmlns:r="http://schemas.openxmlformats.org/officeDocument/2006/relationships" xmlns:m="http://schemas.openxmlformats.org/officeDocument/2006/math" xmlns:v="urn:schemas-microsoft-com:vml" xmlns:wp14="http://schemas.microsoft.com/office/word/2010/wordprocessingDrawing" xmlns:wp="http://schemas.openxmlformats.org/drawingml/2006/wordprocessingDrawing" xmlns:w10="urn:schemas-microsoft-com:office:word" xmlns:w="http://schemas.openxmlformats.org/wordprocessingml/2006/main" xmlns:w14="http://schemas.microsoft.com/office/word/2010/wordml" xmlns:w15="http://schemas.microsoft.com/office/word/2012/wordml" xmlns:w16se="http://schemas.microsoft.com/office/word/2015/wordml/symex" xmlns:wpg="http://schemas.microsoft.com/office/word/2010/wordprocessingGroup" xmlns:wpi="http://schemas.microsoft.com/office/word/2010/wordprocessingInk" xmlns:wne="http://schemas.microsoft.com/office/word/2006/wordml" xmlns:wps="http://schemas.microsoft.com/office/word/2010/wordprocessingShape" mc:Ignorable="w14 w15 w16se wp14">
+<w:numbering xmlns:wpc="http://schemas.microsoft.com/office/word/2010/wordprocessingCanvas" xmlns:cx="http://schemas.microsoft.com/office/drawing/2014/chartex" xmlns:cx1="http://schemas.microsoft.com/office/drawing/2015/9/8/chartex" xmlns:cx2="http://schemas.microsoft.com/office/drawing/2015/10/21/chartex" xmlns:cx3="http://schemas.microsoft.com/office/drawing/2016/5/9/chartex" xmlns:cx4="http://schemas.microsoft.com/office/drawing/2016/5/10/chartex" xmlns:cx5="http://schemas.microsoft.com/office/drawing/2016/5/11/chartex" xmlns:cx6="http://schemas.microsoft.com/office/drawing/2016/5/12/chartex" xmlns:cx7="http://schemas.microsoft.com/office/drawing/2016/5/13/chartex" xmlns:cx8="http://schemas.microsoft.com/office/drawing/2016/5/14/chartex" xmlns:mc="http://schemas.openxmlformats.org/markup-compatibility/2006" xmlns:aink="http://schemas.microsoft.com/office/drawing/2016/ink" xmlns:am3d="http://schemas.microsoft.com/office/drawing/2017/model3d" xmlns:o="urn:schemas-microsoft-com:office:office" xmlns:oel="http://schemas.microsoft.com/office/2019/extlst" xmlns:r="http://schemas.openxmlformats.org/officeDocument/2006/relationships" xmlns:m="http://schemas.openxmlformats.org/officeDocument/2006/math" xmlns:v="urn:schemas-microsoft-com:vml" xmlns:wp14="http://schemas.microsoft.com/office/word/2010/wordprocessingDrawing" xmlns:wp="http://schemas.openxmlformats.org/drawingml/2006/wordprocessingDrawing" xmlns:w10="urn:schemas-microsoft-com:office:word" xmlns:w="http://schemas.openxmlformats.org/wordprocessingml/2006/main" xmlns:w14="http://schemas.microsoft.com/office/word/2010/wordml" xmlns:w15="http://schemas.microsoft.com/office/word/2012/wordml" xmlns:w16cex="http://schemas.microsoft.com/office/word/2018/wordml/cex" xmlns:w16cid="http://schemas.microsoft.com/office/word/2016/wordml/cid" xmlns:w16="http://schemas.microsoft.com/office/word/2018/wordml" xmlns:w16du="http://schemas.microsoft.com/office/word/2023/wordml/word16du" xmlns:w16sdtdh="http://schemas.microsoft.com/office/word/2020/wordml/sdtdatahash" xmlns:w16sdtfl="http://schemas.microsoft.com/office/word/2024/wordml/sdtformatlock" xmlns:w16se="http://schemas.microsoft.com/office/word/2015/wordml/symex" xmlns:wpg="http://schemas.microsoft.com/office/word/2010/wordprocessingGroup" xmlns:wpi="http://schemas.microsoft.com/office/word/2010/wordprocessingInk" xmlns:wne="http://schemas.microsoft.com/office/word/2006/wordml" xmlns:wps="http://schemas.microsoft.com/office/word/2010/wordprocessingShape" mc:Ignorable="w14 w15 w16se w16cid w16 w16cex w16sdtdh w16sdtfl w16du wp14">
   <w:abstractNum w:abstractNumId="0" w15:restartNumberingAfterBreak="0">
     <w:nsid w:val="495B5C67"/>
     <w:multiLevelType w:val="hybridMultilevel"/>
@@ -4166,26 +4121,26 @@
       </w:rPr>
     </w:lvl>
   </w:abstractNum>
-  <w:num w:numId="1">
+  <w:num w:numId="1" w16cid:durableId="1329595429">
     <w:abstractNumId w:val="2"/>
   </w:num>
-  <w:num w:numId="2">
+  <w:num w:numId="2" w16cid:durableId="1783302296">
     <w:abstractNumId w:val="3"/>
   </w:num>
-  <w:num w:numId="3">
+  <w:num w:numId="3" w16cid:durableId="1387290726">
     <w:abstractNumId w:val="1"/>
   </w:num>
-  <w:num w:numId="4">
+  <w:num w:numId="4" w16cid:durableId="1436173412">
     <w:abstractNumId w:val="0"/>
   </w:num>
-  <w:num w:numId="5">
+  <w:num w:numId="5" w16cid:durableId="378362302">
     <w:abstractNumId w:val="4"/>
   </w:num>
 </w:numbering>
 </file>
 
 <file path=word/styles.xml><?xml version="1.0" encoding="utf-8"?>
-<w:styles xmlns:mc="http://schemas.openxmlformats.org/markup-compatibility/2006" xmlns:r="http://schemas.openxmlformats.org/officeDocument/2006/relationships" xmlns:w="http://schemas.openxmlformats.org/wordprocessingml/2006/main" xmlns:w14="http://schemas.microsoft.com/office/word/2010/wordml" xmlns:w15="http://schemas.microsoft.com/office/word/2012/wordml" xmlns:w16se="http://schemas.microsoft.com/office/word/2015/wordml/symex" mc:Ignorable="w14 w15 w16se">
+<w:styles xmlns:mc="http://schemas.openxmlformats.org/markup-compatibility/2006" xmlns:r="http://schemas.openxmlformats.org/officeDocument/2006/relationships" xmlns:w="http://schemas.openxmlformats.org/wordprocessingml/2006/main" xmlns:w14="http://schemas.microsoft.com/office/word/2010/wordml" xmlns:w15="http://schemas.microsoft.com/office/word/2012/wordml" xmlns:w16cex="http://schemas.microsoft.com/office/word/2018/wordml/cex" xmlns:w16cid="http://schemas.microsoft.com/office/word/2016/wordml/cid" xmlns:w16="http://schemas.microsoft.com/office/word/2018/wordml" xmlns:w16du="http://schemas.microsoft.com/office/word/2023/wordml/word16du" xmlns:w16sdtdh="http://schemas.microsoft.com/office/word/2020/wordml/sdtdatahash" xmlns:w16sdtfl="http://schemas.microsoft.com/office/word/2024/wordml/sdtformatlock" xmlns:w16se="http://schemas.microsoft.com/office/word/2015/wordml/symex" mc:Ignorable="w14 w15 w16se w16cid w16 w16cex w16sdtdh w16sdtfl w16du">
   <w:docDefaults>
     <w:rPrDefault>
       <w:rPr>
@@ -4203,7 +4158,7 @@
       </w:pPr>
     </w:pPrDefault>
   </w:docDefaults>
-  <w:latentStyles w:defLockedState="0" w:defUIPriority="99" w:defSemiHidden="0" w:defUnhideWhenUsed="0" w:defQFormat="0" w:count="371">
+  <w:latentStyles w:defLockedState="0" w:defUIPriority="99" w:defSemiHidden="0" w:defUnhideWhenUsed="0" w:defQFormat="0" w:count="376">
     <w:lsdException w:name="Normal" w:uiPriority="0" w:qFormat="1"/>
     <w:lsdException w:name="heading 1" w:uiPriority="9" w:qFormat="1"/>
     <w:lsdException w:name="heading 2" w:semiHidden="1" w:uiPriority="9" w:unhideWhenUsed="1" w:qFormat="1"/>
@@ -4575,6 +4530,11 @@
     <w:lsdException w:name="List Table 5 Dark Accent 6" w:uiPriority="50"/>
     <w:lsdException w:name="List Table 6 Colorful Accent 6" w:uiPriority="51"/>
     <w:lsdException w:name="List Table 7 Colorful Accent 6" w:uiPriority="52"/>
+    <w:lsdException w:name="Mention" w:semiHidden="1" w:unhideWhenUsed="1"/>
+    <w:lsdException w:name="Smart Hyperlink" w:semiHidden="1" w:unhideWhenUsed="1"/>
+    <w:lsdException w:name="Hashtag" w:semiHidden="1" w:unhideWhenUsed="1"/>
+    <w:lsdException w:name="Unresolved Mention" w:semiHidden="1" w:unhideWhenUsed="1"/>
+    <w:lsdException w:name="Smart Link" w:semiHidden="1" w:unhideWhenUsed="1"/>
   </w:latentStyles>
   <w:style w:type="paragraph" w:default="1" w:styleId="Normal">
     <w:name w:val="Normal"/>

</xml_diff>